<commit_message>
Guardado esquema primera versión antes de la actualización
</commit_message>
<xml_diff>
--- a/Documentation/OAT_COMPLETE_REGISTRY_MANUAL_PEDRO_FINAL.docx
+++ b/Documentation/OAT_COMPLETE_REGISTRY_MANUAL_PEDRO_FINAL.docx
@@ -1,6 +1,6 @@
 
 <file path=word/document.xml><?xml version="1.0" encoding="utf-8"?>
-<w:document xmlns:wpc="http://schemas.microsoft.com/office/word/2010/wordprocessingCanvas" xmlns:cx="http://schemas.microsoft.com/office/drawing/2014/chartex" xmlns:cx1="http://schemas.microsoft.com/office/drawing/2015/9/8/chartex" xmlns:cx2="http://schemas.microsoft.com/office/drawing/2015/10/21/chartex" xmlns:cx3="http://schemas.microsoft.com/office/drawing/2016/5/9/chartex" xmlns:cx4="http://schemas.microsoft.com/office/drawing/2016/5/10/chartex" xmlns:cx5="http://schemas.microsoft.com/office/drawing/2016/5/11/chartex" xmlns:cx6="http://schemas.microsoft.com/office/drawing/2016/5/12/chartex" xmlns:cx7="http://schemas.microsoft.com/office/drawing/2016/5/13/chartex" xmlns:cx8="http://schemas.microsoft.com/office/drawing/2016/5/14/chartex" xmlns:mc="http://schemas.openxmlformats.org/markup-compatibility/2006" xmlns:aink="http://schemas.microsoft.com/office/drawing/2016/ink" xmlns:am3d="http://schemas.microsoft.com/office/drawing/2017/model3d" xmlns:o="urn:schemas-microsoft-com:office:office" xmlns:oel="http://schemas.microsoft.com/office/2019/extlst" xmlns:r="http://schemas.openxmlformats.org/officeDocument/2006/relationships" xmlns:m="http://schemas.openxmlformats.org/officeDocument/2006/math" xmlns:v="urn:schemas-microsoft-com:vml" xmlns:wp14="http://schemas.microsoft.com/office/word/2010/wordprocessingDrawing" xmlns:wp="http://schemas.openxmlformats.org/drawingml/2006/wordprocessingDrawing" xmlns:w10="urn:schemas-microsoft-com:office:word" xmlns:w="http://schemas.openxmlformats.org/wordprocessingml/2006/main" xmlns:w14="http://schemas.microsoft.com/office/word/2010/wordml" xmlns:w15="http://schemas.microsoft.com/office/word/2012/wordml" xmlns:w16cex="http://schemas.microsoft.com/office/word/2018/wordml/cex" xmlns:w16cid="http://schemas.microsoft.com/office/word/2016/wordml/cid" xmlns:w16="http://schemas.microsoft.com/office/word/2018/wordml" xmlns:w16du="http://schemas.microsoft.com/office/word/2023/wordml/word16du" xmlns:w16sdtdh="http://schemas.microsoft.com/office/word/2020/wordml/sdtdatahash" xmlns:w16sdtfl="http://schemas.microsoft.com/office/word/2024/wordml/sdtformatlock" xmlns:w16se="http://schemas.microsoft.com/office/word/2015/wordml/symex" xmlns:wpg="http://schemas.microsoft.com/office/word/2010/wordprocessingGroup" xmlns:wpi="http://schemas.microsoft.com/office/word/2010/wordprocessingInk" xmlns:wne="http://schemas.microsoft.com/office/word/2006/wordml" xmlns:wps="http://schemas.microsoft.com/office/word/2010/wordprocessingShape" mc:Ignorable="w14 w15 w16se w16cid w16 w16cex w16sdtdh w16sdtfl w16du wp14">
+<w:document xmlns:wpc="http://schemas.microsoft.com/office/word/2010/wordprocessingCanvas" xmlns:cx="http://schemas.microsoft.com/office/drawing/2014/chartex" xmlns:cx1="http://schemas.microsoft.com/office/drawing/2015/9/8/chartex" xmlns:cx2="http://schemas.microsoft.com/office/drawing/2015/10/21/chartex" xmlns:cx3="http://schemas.microsoft.com/office/drawing/2016/5/9/chartex" xmlns:cx4="http://schemas.microsoft.com/office/drawing/2016/5/10/chartex" xmlns:cx5="http://schemas.microsoft.com/office/drawing/2016/5/11/chartex" xmlns:cx6="http://schemas.microsoft.com/office/drawing/2016/5/12/chartex" xmlns:cx7="http://schemas.microsoft.com/office/drawing/2016/5/13/chartex" xmlns:cx8="http://schemas.microsoft.com/office/drawing/2016/5/14/chartex" xmlns:mc="http://schemas.openxmlformats.org/markup-compatibility/2006" xmlns:aink="http://schemas.microsoft.com/office/drawing/2016/ink" xmlns:am3d="http://schemas.microsoft.com/office/drawing/2017/model3d" xmlns:o="urn:schemas-microsoft-com:office:office" xmlns:r="http://schemas.openxmlformats.org/officeDocument/2006/relationships" xmlns:m="http://schemas.openxmlformats.org/officeDocument/2006/math" xmlns:v="urn:schemas-microsoft-com:vml" xmlns:wp14="http://schemas.microsoft.com/office/word/2010/wordprocessingDrawing" xmlns:wp="http://schemas.openxmlformats.org/drawingml/2006/wordprocessingDrawing" xmlns:w10="urn:schemas-microsoft-com:office:word" xmlns:w="http://schemas.openxmlformats.org/wordprocessingml/2006/main" xmlns:w14="http://schemas.microsoft.com/office/word/2010/wordml" xmlns:w15="http://schemas.microsoft.com/office/word/2012/wordml" xmlns:w16cex="http://schemas.microsoft.com/office/word/2018/wordml/cex" xmlns:w16cid="http://schemas.microsoft.com/office/word/2016/wordml/cid" xmlns:w16="http://schemas.microsoft.com/office/word/2018/wordml" xmlns:w16sdtdh="http://schemas.microsoft.com/office/word/2020/wordml/sdtdatahash" xmlns:w16se="http://schemas.microsoft.com/office/word/2015/wordml/symex" xmlns:wpg="http://schemas.microsoft.com/office/word/2010/wordprocessingGroup" xmlns:wpi="http://schemas.microsoft.com/office/word/2010/wordprocessingInk" xmlns:wne="http://schemas.microsoft.com/office/word/2006/wordml" xmlns:wps="http://schemas.microsoft.com/office/word/2010/wordprocessingShape" mc:Ignorable="w14 w15 w16se w16cid w16 w16cex w16sdtdh wp14">
   <w:body>
     <w:p>
       <w:pPr>
@@ -42,6 +42,13 @@
         </w:rPr>
         <w:t>Section 1. Administrative and Patient Identification Variables</w:t>
       </w:r>
+      <w:r>
+        <w:rPr>
+          <w:b/>
+          <w:sz w:val="32"/>
+        </w:rPr>
+        <w:t>: A/NA</w:t>
+      </w:r>
     </w:p>
     <w:p>
       <w:pPr>
@@ -51,23 +58,7 @@
         <w:t>Administrative variables ensure patient identification, tracking, and registry integrity.</w:t>
       </w:r>
       <w:r>
-        <w:t xml:space="preserve"> Each patient is assigned a unique </w:t>
-      </w:r>
-      <w:proofErr w:type="spellStart"/>
-      <w:r>
-        <w:t>anonymised</w:t>
-      </w:r>
-      <w:proofErr w:type="spellEnd"/>
-      <w:r>
-        <w:t xml:space="preserve"> registry identifier (</w:t>
-      </w:r>
-      <w:proofErr w:type="spellStart"/>
-      <w:r>
-        <w:t>Patient_ID</w:t>
-      </w:r>
-      <w:proofErr w:type="spellEnd"/>
-      <w:r>
-        <w:t>) to ensure confidentiality. Administrative variables include date of consultation, hospital or clinic number, referring physician, contact information, insurance details, and payment method. These variables allow patient tracking, registry management, and coordination of care.</w:t>
+        <w:t xml:space="preserve"> Each patient is assigned a unique anonymised registry identifier (Patient_ID) to ensure confidentiality. Administrative variables include date of consultation, hospital or clinic number, referring physician, contact information, insurance details, and payment method. These variables allow patient tracking, registry management, and coordination of care.</w:t>
       </w:r>
     </w:p>
     <w:p/>
@@ -316,6 +307,13 @@
         </w:rPr>
         <w:lastRenderedPageBreak/>
         <w:t>Section 2. Demographic, Social, and Anthropometric Variables</w:t>
+      </w:r>
+      <w:r>
+        <w:rPr>
+          <w:b/>
+          <w:sz w:val="32"/>
+        </w:rPr>
+        <w:t>: A/NA</w:t>
       </w:r>
     </w:p>
     <w:p>
@@ -783,6 +781,13 @@
           <w:sz w:val="32"/>
         </w:rPr>
         <w:t>Section 3. Presenting Symptoms and Chief Complaints</w:t>
+      </w:r>
+      <w:r>
+        <w:rPr>
+          <w:b/>
+          <w:sz w:val="32"/>
+        </w:rPr>
+        <w:t>: A/NA</w:t>
       </w:r>
     </w:p>
     <w:p>
@@ -941,11 +946,10 @@
             <w:tcW w:w="2880" w:type="dxa"/>
           </w:tcPr>
           <w:p>
-            <w:proofErr w:type="spellStart"/>
-            <w:r>
+            <w:r>
+              <w:lastRenderedPageBreak/>
               <w:t>Sleep_initiation</w:t>
             </w:r>
-            <w:proofErr w:type="spellEnd"/>
           </w:p>
         </w:tc>
         <w:tc>
@@ -975,12 +979,9 @@
             <w:tcW w:w="2880" w:type="dxa"/>
           </w:tcPr>
           <w:p>
-            <w:proofErr w:type="spellStart"/>
-            <w:r>
-              <w:lastRenderedPageBreak/>
+            <w:r>
               <w:t>Nighttime_awakening</w:t>
             </w:r>
-            <w:proofErr w:type="spellEnd"/>
           </w:p>
         </w:tc>
         <w:tc>
@@ -1010,11 +1011,9 @@
             <w:tcW w:w="2880" w:type="dxa"/>
           </w:tcPr>
           <w:p>
-            <w:proofErr w:type="spellStart"/>
             <w:r>
               <w:t>Nonrestorative_Sleep</w:t>
             </w:r>
-            <w:proofErr w:type="spellEnd"/>
           </w:p>
         </w:tc>
         <w:tc>
@@ -1140,11 +1139,9 @@
             <w:tcW w:w="2880" w:type="dxa"/>
           </w:tcPr>
           <w:p>
-            <w:proofErr w:type="spellStart"/>
             <w:r>
               <w:t>Jawjoint_pain</w:t>
             </w:r>
-            <w:proofErr w:type="spellEnd"/>
           </w:p>
         </w:tc>
         <w:tc>
@@ -1177,6 +1174,13 @@
           <w:sz w:val="32"/>
         </w:rPr>
         <w:t>Section 4. Medical History and Medication Variables</w:t>
+      </w:r>
+      <w:r>
+        <w:rPr>
+          <w:b/>
+          <w:sz w:val="32"/>
+        </w:rPr>
+        <w:t>: A/NA</w:t>
       </w:r>
     </w:p>
     <w:p>
@@ -1504,6 +1508,13 @@
         </w:rPr>
         <w:t>Section 5. Sleep History Variables</w:t>
       </w:r>
+      <w:r>
+        <w:rPr>
+          <w:b/>
+          <w:sz w:val="32"/>
+        </w:rPr>
+        <w:t>: A/NA</w:t>
+      </w:r>
     </w:p>
     <w:p>
       <w:pPr>
@@ -1670,6 +1681,7 @@
           </w:tcPr>
           <w:p>
             <w:r>
+              <w:lastRenderedPageBreak/>
               <w:t>Parasomnias</w:t>
             </w:r>
           </w:p>
@@ -1701,11 +1713,9 @@
             <w:tcW w:w="2880" w:type="dxa"/>
           </w:tcPr>
           <w:p>
-            <w:proofErr w:type="spellStart"/>
             <w:r>
               <w:t>CPAP_Use</w:t>
             </w:r>
-            <w:proofErr w:type="spellEnd"/>
           </w:p>
         </w:tc>
         <w:tc>
@@ -1736,7 +1746,6 @@
           </w:tcPr>
           <w:p>
             <w:r>
-              <w:lastRenderedPageBreak/>
               <w:t>Sleep_Position</w:t>
             </w:r>
           </w:p>
@@ -1832,11 +1841,9 @@
             <w:tcW w:w="2880" w:type="dxa"/>
           </w:tcPr>
           <w:p>
-            <w:proofErr w:type="spellStart"/>
             <w:r>
               <w:t>ENT_surgery</w:t>
             </w:r>
-            <w:proofErr w:type="spellEnd"/>
           </w:p>
         </w:tc>
         <w:tc>
@@ -1866,11 +1873,9 @@
             <w:tcW w:w="2880" w:type="dxa"/>
           </w:tcPr>
           <w:p>
-            <w:proofErr w:type="spellStart"/>
             <w:r>
               <w:t>Medication_Sleep</w:t>
             </w:r>
-            <w:proofErr w:type="spellEnd"/>
           </w:p>
         </w:tc>
         <w:tc>
@@ -1904,21 +1909,20 @@
         </w:rPr>
         <w:t>Section 6. Questionnaire Variables</w:t>
       </w:r>
+      <w:r>
+        <w:rPr>
+          <w:b/>
+          <w:sz w:val="32"/>
+        </w:rPr>
+        <w:t>: A/NA</w:t>
+      </w:r>
     </w:p>
     <w:p>
       <w:pPr>
         <w:spacing w:after="120"/>
       </w:pPr>
       <w:r>
-        <w:t xml:space="preserve">Validated questionnaires are used to assess sleep symptoms and quality of life. These include the Epworth Sleepiness Scale, which measures daytime sleepiness; the Insomnia Severity Index (ISI); quality of life questionnaires; and </w:t>
-      </w:r>
-      <w:proofErr w:type="spellStart"/>
-      <w:r>
-        <w:t>SnoreLab</w:t>
-      </w:r>
-      <w:proofErr w:type="spellEnd"/>
-      <w:r>
-        <w:t xml:space="preserve"> scores when available. These scores are recorded as numeric variables</w:t>
+        <w:t>Validated questionnaires are used to assess sleep symptoms and quality of life. These include the Epworth Sleepiness Scale, which measures daytime sleepiness; the Insomnia Severity Index (ISI); quality of life questionnaires; and SnoreLab scores when available. These scores are recorded as numeric variables</w:t>
       </w:r>
       <w:r>
         <w:t>.</w:t>
@@ -2101,25 +2105,18 @@
             <w:tcW w:w="2880" w:type="dxa"/>
           </w:tcPr>
           <w:p>
-            <w:proofErr w:type="spellStart"/>
             <w:r>
               <w:t>SnoreLab_Epic</w:t>
             </w:r>
-            <w:proofErr w:type="spellEnd"/>
-          </w:p>
-        </w:tc>
-        <w:tc>
-          <w:tcPr>
-            <w:tcW w:w="2880" w:type="dxa"/>
-          </w:tcPr>
-          <w:p>
-            <w:proofErr w:type="spellStart"/>
-            <w:r>
-              <w:t>SnoreLab</w:t>
-            </w:r>
-            <w:proofErr w:type="spellEnd"/>
-            <w:r>
-              <w:t xml:space="preserve"> Epic score</w:t>
+          </w:p>
+        </w:tc>
+        <w:tc>
+          <w:tcPr>
+            <w:tcW w:w="2880" w:type="dxa"/>
+          </w:tcPr>
+          <w:p>
+            <w:r>
+              <w:t>SnoreLab Epic score</w:t>
             </w:r>
           </w:p>
         </w:tc>
@@ -2143,6 +2140,13 @@
           <w:sz w:val="32"/>
         </w:rPr>
         <w:t>Section 7. Apnea Assessment Questionnaire</w:t>
+      </w:r>
+      <w:r>
+        <w:rPr>
+          <w:b/>
+          <w:sz w:val="32"/>
+        </w:rPr>
+        <w:t>: A/NA</w:t>
       </w:r>
     </w:p>
     <w:p>
@@ -2207,11 +2211,9 @@
             <w:tcW w:w="2880" w:type="dxa"/>
           </w:tcPr>
           <w:p>
-            <w:proofErr w:type="spellStart"/>
             <w:r>
               <w:t>Observed_Apnea</w:t>
             </w:r>
-            <w:proofErr w:type="spellEnd"/>
           </w:p>
         </w:tc>
         <w:tc>
@@ -2241,11 +2243,9 @@
             <w:tcW w:w="2880" w:type="dxa"/>
           </w:tcPr>
           <w:p>
-            <w:proofErr w:type="spellStart"/>
             <w:r>
               <w:t>Morning_Headaches</w:t>
             </w:r>
-            <w:proofErr w:type="spellEnd"/>
           </w:p>
         </w:tc>
         <w:tc>
@@ -2275,26 +2275,19 @@
             <w:tcW w:w="2880" w:type="dxa"/>
           </w:tcPr>
           <w:p>
-            <w:proofErr w:type="spellStart"/>
             <w:r>
               <w:t>Nighttime_Awakening</w:t>
             </w:r>
-            <w:proofErr w:type="spellEnd"/>
-          </w:p>
-        </w:tc>
-        <w:tc>
-          <w:tcPr>
-            <w:tcW w:w="2880" w:type="dxa"/>
-          </w:tcPr>
-          <w:p>
-            <w:r>
-              <w:t xml:space="preserve">Frequency of Nighttime </w:t>
-            </w:r>
-            <w:proofErr w:type="spellStart"/>
-            <w:r>
-              <w:t>acakenings</w:t>
-            </w:r>
-            <w:proofErr w:type="spellEnd"/>
+          </w:p>
+        </w:tc>
+        <w:tc>
+          <w:tcPr>
+            <w:tcW w:w="2880" w:type="dxa"/>
+          </w:tcPr>
+          <w:p>
+            <w:r>
+              <w:t>Frequency of Nighttime acakenings</w:t>
+            </w:r>
           </w:p>
         </w:tc>
         <w:tc>
@@ -2315,6 +2308,7 @@
           </w:tcPr>
           <w:p>
             <w:r>
+              <w:lastRenderedPageBreak/>
               <w:t>Nocturia</w:t>
             </w:r>
           </w:p>
@@ -2347,14 +2341,8 @@
           </w:tcPr>
           <w:p>
             <w:r>
-              <w:lastRenderedPageBreak/>
-              <w:t>Non-</w:t>
-            </w:r>
-            <w:proofErr w:type="spellStart"/>
-            <w:r>
-              <w:t>restorative_Sleep</w:t>
-            </w:r>
-            <w:proofErr w:type="spellEnd"/>
+              <w:t>Non-restorative_Sleep</w:t>
+            </w:r>
           </w:p>
         </w:tc>
         <w:tc>
@@ -2525,6 +2513,13 @@
           <w:sz w:val="32"/>
         </w:rPr>
         <w:t>Section 8. Snoring Assessment Questionnaire</w:t>
+      </w:r>
+      <w:r>
+        <w:rPr>
+          <w:b/>
+          <w:sz w:val="32"/>
+        </w:rPr>
+        <w:t>: A/NA</w:t>
       </w:r>
     </w:p>
     <w:p>
@@ -2596,11 +2591,9 @@
             <w:tcW w:w="2880" w:type="dxa"/>
           </w:tcPr>
           <w:p>
-            <w:proofErr w:type="spellStart"/>
             <w:r>
               <w:t>Snoring_evolution</w:t>
             </w:r>
-            <w:proofErr w:type="spellEnd"/>
           </w:p>
         </w:tc>
         <w:tc>
@@ -2630,11 +2623,10 @@
             <w:tcW w:w="2880" w:type="dxa"/>
           </w:tcPr>
           <w:p>
-            <w:proofErr w:type="spellStart"/>
-            <w:r>
+            <w:r>
+              <w:lastRenderedPageBreak/>
               <w:t>Snoring_frequency</w:t>
             </w:r>
-            <w:proofErr w:type="spellEnd"/>
           </w:p>
         </w:tc>
         <w:tc>
@@ -2664,11 +2656,9 @@
             <w:tcW w:w="2880" w:type="dxa"/>
           </w:tcPr>
           <w:p>
-            <w:proofErr w:type="spellStart"/>
             <w:r>
               <w:t>Snoring_intensity</w:t>
             </w:r>
-            <w:proofErr w:type="spellEnd"/>
           </w:p>
         </w:tc>
         <w:tc>
@@ -2698,12 +2688,9 @@
             <w:tcW w:w="2880" w:type="dxa"/>
           </w:tcPr>
           <w:p>
-            <w:proofErr w:type="spellStart"/>
-            <w:r>
-              <w:lastRenderedPageBreak/>
+            <w:r>
               <w:t>Dry_mouth</w:t>
             </w:r>
-            <w:proofErr w:type="spellEnd"/>
           </w:p>
         </w:tc>
         <w:tc>
@@ -2733,11 +2720,9 @@
             <w:tcW w:w="2880" w:type="dxa"/>
           </w:tcPr>
           <w:p>
-            <w:proofErr w:type="spellStart"/>
             <w:r>
               <w:t>Irritated_throat</w:t>
             </w:r>
-            <w:proofErr w:type="spellEnd"/>
           </w:p>
         </w:tc>
         <w:tc>
@@ -2767,11 +2752,9 @@
             <w:tcW w:w="2880" w:type="dxa"/>
           </w:tcPr>
           <w:p>
-            <w:proofErr w:type="spellStart"/>
             <w:r>
               <w:t>Nasal_congestion</w:t>
             </w:r>
-            <w:proofErr w:type="spellEnd"/>
           </w:p>
         </w:tc>
         <w:tc>
@@ -2801,11 +2784,9 @@
             <w:tcW w:w="2880" w:type="dxa"/>
           </w:tcPr>
           <w:p>
-            <w:proofErr w:type="spellStart"/>
             <w:r>
               <w:t>Tooth_grinding</w:t>
             </w:r>
-            <w:proofErr w:type="spellEnd"/>
           </w:p>
         </w:tc>
         <w:tc>
@@ -3193,10 +3174,16 @@
         </w:rPr>
         <w:t>Section 9. Physical Examination Variables</w:t>
       </w:r>
+      <w:r>
+        <w:rPr>
+          <w:b/>
+          <w:sz w:val="32"/>
+        </w:rPr>
+        <w:t>: A/NA</w:t>
+      </w:r>
     </w:p>
     <w:p>
       <w:r>
-        <w:lastRenderedPageBreak/>
         <w:t>The Physical Examination Variables include standardized clinical assessments of the upper airway, oral and dental structures, mandibular function, and temporomandibular joint status to identify anatomical and functional factors relevant to sleep-disordered breathing and oral appliance therapy</w:t>
       </w:r>
       <w:r>
@@ -3268,11 +3255,9 @@
             <w:tcW w:w="2880" w:type="dxa"/>
           </w:tcPr>
           <w:p>
-            <w:proofErr w:type="spellStart"/>
             <w:r>
               <w:t>Tonsil_size</w:t>
             </w:r>
-            <w:proofErr w:type="spellEnd"/>
           </w:p>
         </w:tc>
         <w:tc>
@@ -3302,11 +3287,9 @@
             <w:tcW w:w="2880" w:type="dxa"/>
           </w:tcPr>
           <w:p>
-            <w:proofErr w:type="spellStart"/>
             <w:r>
               <w:t>Friedman_tongue</w:t>
             </w:r>
-            <w:proofErr w:type="spellEnd"/>
           </w:p>
         </w:tc>
         <w:tc>
@@ -3336,11 +3319,9 @@
             <w:tcW w:w="2880" w:type="dxa"/>
           </w:tcPr>
           <w:p>
-            <w:proofErr w:type="spellStart"/>
             <w:r>
               <w:t>Uvula_elongation</w:t>
             </w:r>
-            <w:proofErr w:type="spellEnd"/>
           </w:p>
         </w:tc>
         <w:tc>
@@ -3370,11 +3351,9 @@
             <w:tcW w:w="2880" w:type="dxa"/>
           </w:tcPr>
           <w:p>
-            <w:proofErr w:type="spellStart"/>
             <w:r>
               <w:t>Lingual_frenulum</w:t>
             </w:r>
-            <w:proofErr w:type="spellEnd"/>
           </w:p>
         </w:tc>
         <w:tc>
@@ -3404,11 +3383,9 @@
             <w:tcW w:w="2880" w:type="dxa"/>
           </w:tcPr>
           <w:p>
-            <w:proofErr w:type="spellStart"/>
             <w:r>
               <w:t>Dental_status</w:t>
             </w:r>
-            <w:proofErr w:type="spellEnd"/>
           </w:p>
         </w:tc>
         <w:tc>
@@ -3438,11 +3415,9 @@
             <w:tcW w:w="2880" w:type="dxa"/>
           </w:tcPr>
           <w:p>
-            <w:proofErr w:type="spellStart"/>
             <w:r>
               <w:t>Dental_arch</w:t>
             </w:r>
-            <w:proofErr w:type="spellEnd"/>
           </w:p>
         </w:tc>
         <w:tc>
@@ -3504,11 +3479,9 @@
             <w:tcW w:w="2880" w:type="dxa"/>
           </w:tcPr>
           <w:p>
-            <w:proofErr w:type="spellStart"/>
             <w:r>
               <w:t>Facial_profile</w:t>
             </w:r>
-            <w:proofErr w:type="spellEnd"/>
           </w:p>
         </w:tc>
         <w:tc>
@@ -3538,11 +3511,9 @@
             <w:tcW w:w="2880" w:type="dxa"/>
           </w:tcPr>
           <w:p>
-            <w:proofErr w:type="spellStart"/>
             <w:r>
               <w:t>ROM_Vertical</w:t>
             </w:r>
-            <w:proofErr w:type="spellEnd"/>
           </w:p>
         </w:tc>
         <w:tc>
@@ -3561,7 +3532,10 @@
           </w:tcPr>
           <w:p>
             <w:r>
-              <w:t>mm</w:t>
+              <w:t>M</w:t>
+            </w:r>
+            <w:r>
+              <w:t>m</w:t>
             </w:r>
           </w:p>
         </w:tc>
@@ -3583,22 +3557,20 @@
           </w:tcPr>
           <w:p>
             <w:r>
-              <w:t xml:space="preserve">Range of motion </w:t>
-            </w:r>
-            <w:proofErr w:type="spellStart"/>
-            <w:r>
-              <w:t>Anteropost</w:t>
-            </w:r>
-            <w:proofErr w:type="spellEnd"/>
-          </w:p>
-        </w:tc>
-        <w:tc>
-          <w:tcPr>
-            <w:tcW w:w="2880" w:type="dxa"/>
-          </w:tcPr>
-          <w:p>
-            <w:r>
-              <w:t>mm</w:t>
+              <w:t>Range of motion Anteropost</w:t>
+            </w:r>
+          </w:p>
+        </w:tc>
+        <w:tc>
+          <w:tcPr>
+            <w:tcW w:w="2880" w:type="dxa"/>
+          </w:tcPr>
+          <w:p>
+            <w:r>
+              <w:t>M</w:t>
+            </w:r>
+            <w:r>
+              <w:t>m</w:t>
             </w:r>
           </w:p>
         </w:tc>
@@ -3609,11 +3581,9 @@
             <w:tcW w:w="2880" w:type="dxa"/>
           </w:tcPr>
           <w:p>
-            <w:proofErr w:type="spellStart"/>
             <w:r>
               <w:t>GeorgeG_mxret</w:t>
             </w:r>
-            <w:proofErr w:type="spellEnd"/>
           </w:p>
         </w:tc>
         <w:tc>
@@ -3632,7 +3602,10 @@
           </w:tcPr>
           <w:p>
             <w:r>
-              <w:t>mm</w:t>
+              <w:t>M</w:t>
+            </w:r>
+            <w:r>
+              <w:t>m</w:t>
             </w:r>
           </w:p>
         </w:tc>
@@ -3643,11 +3616,9 @@
             <w:tcW w:w="2880" w:type="dxa"/>
           </w:tcPr>
           <w:p>
-            <w:proofErr w:type="spellStart"/>
             <w:r>
               <w:t>GeorgeG_mxret</w:t>
             </w:r>
-            <w:proofErr w:type="spellEnd"/>
           </w:p>
         </w:tc>
         <w:tc>
@@ -3666,7 +3637,10 @@
           </w:tcPr>
           <w:p>
             <w:r>
-              <w:t>mm</w:t>
+              <w:t>M</w:t>
+            </w:r>
+            <w:r>
+              <w:t>m</w:t>
             </w:r>
           </w:p>
         </w:tc>
@@ -3677,28 +3651,18 @@
             <w:tcW w:w="2880" w:type="dxa"/>
           </w:tcPr>
           <w:p>
-            <w:proofErr w:type="spellStart"/>
             <w:r>
               <w:t>Linea_alba</w:t>
             </w:r>
-            <w:proofErr w:type="spellEnd"/>
-          </w:p>
-        </w:tc>
-        <w:tc>
-          <w:tcPr>
-            <w:tcW w:w="2880" w:type="dxa"/>
-          </w:tcPr>
-          <w:p>
-            <w:r>
-              <w:t xml:space="preserve">Oral mucosa </w:t>
-            </w:r>
-            <w:proofErr w:type="spellStart"/>
-            <w:r>
-              <w:t>linea</w:t>
-            </w:r>
-            <w:proofErr w:type="spellEnd"/>
-            <w:r>
-              <w:t xml:space="preserve"> alba</w:t>
+          </w:p>
+        </w:tc>
+        <w:tc>
+          <w:tcPr>
+            <w:tcW w:w="2880" w:type="dxa"/>
+          </w:tcPr>
+          <w:p>
+            <w:r>
+              <w:t>Oral mucosa linea alba</w:t>
             </w:r>
           </w:p>
         </w:tc>
@@ -3751,11 +3715,9 @@
             <w:tcW w:w="2880" w:type="dxa"/>
           </w:tcPr>
           <w:p>
-            <w:proofErr w:type="spellStart"/>
             <w:r>
               <w:t>Worn_teeth</w:t>
             </w:r>
-            <w:proofErr w:type="spellEnd"/>
           </w:p>
         </w:tc>
         <w:tc>
@@ -3785,11 +3747,9 @@
             <w:tcW w:w="2880" w:type="dxa"/>
           </w:tcPr>
           <w:p>
-            <w:proofErr w:type="spellStart"/>
             <w:r>
               <w:t>Muscle_tenderness</w:t>
             </w:r>
-            <w:proofErr w:type="spellEnd"/>
           </w:p>
         </w:tc>
         <w:tc>
@@ -3819,11 +3779,9 @@
             <w:tcW w:w="2880" w:type="dxa"/>
           </w:tcPr>
           <w:p>
-            <w:proofErr w:type="spellStart"/>
             <w:r>
               <w:t>Joint_sounds</w:t>
             </w:r>
-            <w:proofErr w:type="spellEnd"/>
           </w:p>
         </w:tc>
         <w:tc>
@@ -3853,11 +3811,9 @@
             <w:tcW w:w="2880" w:type="dxa"/>
           </w:tcPr>
           <w:p>
-            <w:proofErr w:type="spellStart"/>
             <w:r>
               <w:t>Mouth_breathing</w:t>
             </w:r>
-            <w:proofErr w:type="spellEnd"/>
           </w:p>
         </w:tc>
         <w:tc>
@@ -3952,6 +3908,7 @@
         <w:rPr>
           <w:sz w:val="24"/>
         </w:rPr>
+        <w:lastRenderedPageBreak/>
         <w:t>•</w:t>
       </w:r>
       <w:r>
@@ -3974,7 +3931,6 @@
         <w:rPr>
           <w:sz w:val="24"/>
         </w:rPr>
-        <w:lastRenderedPageBreak/>
         <w:t>•</w:t>
       </w:r>
       <w:r>
@@ -4219,21 +4175,7 @@
         <w:rPr>
           <w:sz w:val="24"/>
         </w:rPr>
-        <w:t>Tongue: size &amp; length (</w:t>
-      </w:r>
-      <w:proofErr w:type="spellStart"/>
-      <w:r>
-        <w:rPr>
-          <w:sz w:val="24"/>
-        </w:rPr>
-        <w:t>Macroglosia</w:t>
-      </w:r>
-      <w:proofErr w:type="spellEnd"/>
-      <w:r>
-        <w:rPr>
-          <w:sz w:val="24"/>
-        </w:rPr>
-        <w:t xml:space="preserve">) </w:t>
+        <w:t xml:space="preserve">Tongue: size &amp; length (Macroglosia) </w:t>
       </w:r>
     </w:p>
     <w:p>
@@ -4326,21 +4268,7 @@
         <w:rPr>
           <w:sz w:val="24"/>
         </w:rPr>
-        <w:t xml:space="preserve">Joint Sounds (Clicking / Popping / Crepitus) Assessed during: Slow open/close, Lateral </w:t>
-      </w:r>
-      <w:proofErr w:type="spellStart"/>
-      <w:r>
-        <w:rPr>
-          <w:sz w:val="24"/>
-        </w:rPr>
-        <w:t>excursión</w:t>
-      </w:r>
-      <w:proofErr w:type="spellEnd"/>
-      <w:r>
-        <w:rPr>
-          <w:sz w:val="24"/>
-        </w:rPr>
-        <w:t>, Protrusion</w:t>
+        <w:t>Joint Sounds (Clicking / Popping / Crepitus) Assessed during: Slow open/close, Lateral excursión, Protrusion</w:t>
       </w:r>
     </w:p>
     <w:p>
@@ -4423,6 +4351,13 @@
           <w:sz w:val="32"/>
         </w:rPr>
         <w:t>Section 10. Sleep Study Variables</w:t>
+      </w:r>
+      <w:r>
+        <w:rPr>
+          <w:b/>
+          <w:sz w:val="32"/>
+        </w:rPr>
+        <w:t>: A/NA</w:t>
       </w:r>
     </w:p>
     <w:p>
@@ -4544,11 +4479,9 @@
             <w:tcW w:w="2880" w:type="dxa"/>
           </w:tcPr>
           <w:p>
-            <w:proofErr w:type="spellStart"/>
             <w:r>
               <w:t>Supine_AHI</w:t>
             </w:r>
-            <w:proofErr w:type="spellEnd"/>
           </w:p>
         </w:tc>
         <w:tc>
@@ -4578,11 +4511,9 @@
             <w:tcW w:w="2880" w:type="dxa"/>
           </w:tcPr>
           <w:p>
-            <w:proofErr w:type="spellStart"/>
             <w:r>
               <w:t>Time_Supine</w:t>
             </w:r>
-            <w:proofErr w:type="spellEnd"/>
           </w:p>
         </w:tc>
         <w:tc>
@@ -4612,11 +4543,9 @@
             <w:tcW w:w="2880" w:type="dxa"/>
           </w:tcPr>
           <w:p>
-            <w:proofErr w:type="spellStart"/>
             <w:r>
               <w:t>Hypoxic_Burden</w:t>
             </w:r>
-            <w:proofErr w:type="spellEnd"/>
           </w:p>
         </w:tc>
         <w:tc>
@@ -4734,11 +4663,9 @@
             <w:tcW w:w="2880" w:type="dxa"/>
           </w:tcPr>
           <w:p>
-            <w:proofErr w:type="spellStart"/>
             <w:r>
               <w:t>Total_Sleep_Time</w:t>
             </w:r>
-            <w:proofErr w:type="spellEnd"/>
           </w:p>
         </w:tc>
         <w:tc>
@@ -4779,6 +4706,13 @@
           <w:sz w:val="32"/>
         </w:rPr>
         <w:t>Section 11. Diagnostic Imaging Variables</w:t>
+      </w:r>
+      <w:r>
+        <w:rPr>
+          <w:b/>
+          <w:sz w:val="32"/>
+        </w:rPr>
+        <w:t>: A/NA</w:t>
       </w:r>
     </w:p>
     <w:p>
@@ -4903,7 +4837,10 @@
           </w:tcPr>
           <w:p>
             <w:r>
-              <w:t>mm</w:t>
+              <w:t>M</w:t>
+            </w:r>
+            <w:r>
+              <w:t>m</w:t>
             </w:r>
           </w:p>
         </w:tc>
@@ -4938,7 +4875,10 @@
           </w:tcPr>
           <w:p>
             <w:r>
-              <w:t>mm</w:t>
+              <w:t>M</w:t>
+            </w:r>
+            <w:r>
+              <w:t>m</w:t>
             </w:r>
           </w:p>
         </w:tc>
@@ -4981,35 +4921,31 @@
             <w:tcW w:w="2880" w:type="dxa"/>
           </w:tcPr>
           <w:p>
-            <w:proofErr w:type="spellStart"/>
             <w:r>
               <w:t>CBCT_softpalate_length</w:t>
             </w:r>
-            <w:proofErr w:type="spellEnd"/>
-          </w:p>
-        </w:tc>
-        <w:tc>
-          <w:tcPr>
-            <w:tcW w:w="2880" w:type="dxa"/>
-          </w:tcPr>
-          <w:p>
-            <w:proofErr w:type="spellStart"/>
-            <w:r>
-              <w:t>Softpalate</w:t>
-            </w:r>
-            <w:proofErr w:type="spellEnd"/>
-            <w:r>
-              <w:t xml:space="preserve"> length</w:t>
-            </w:r>
-          </w:p>
-        </w:tc>
-        <w:tc>
-          <w:tcPr>
-            <w:tcW w:w="2880" w:type="dxa"/>
-          </w:tcPr>
-          <w:p>
-            <w:r>
-              <w:t>mm</w:t>
+          </w:p>
+        </w:tc>
+        <w:tc>
+          <w:tcPr>
+            <w:tcW w:w="2880" w:type="dxa"/>
+          </w:tcPr>
+          <w:p>
+            <w:r>
+              <w:t>Softpalate length</w:t>
+            </w:r>
+          </w:p>
+        </w:tc>
+        <w:tc>
+          <w:tcPr>
+            <w:tcW w:w="2880" w:type="dxa"/>
+          </w:tcPr>
+          <w:p>
+            <w:r>
+              <w:t>M</w:t>
+            </w:r>
+            <w:r>
+              <w:t>m</w:t>
             </w:r>
           </w:p>
         </w:tc>
@@ -5020,35 +4956,31 @@
             <w:tcW w:w="2880" w:type="dxa"/>
           </w:tcPr>
           <w:p>
-            <w:proofErr w:type="spellStart"/>
             <w:r>
               <w:t>CBCT_softpalate_width</w:t>
             </w:r>
-            <w:proofErr w:type="spellEnd"/>
-          </w:p>
-        </w:tc>
-        <w:tc>
-          <w:tcPr>
-            <w:tcW w:w="2880" w:type="dxa"/>
-          </w:tcPr>
-          <w:p>
-            <w:proofErr w:type="spellStart"/>
-            <w:r>
-              <w:t>Softpalate</w:t>
-            </w:r>
-            <w:proofErr w:type="spellEnd"/>
-            <w:r>
-              <w:t xml:space="preserve"> width</w:t>
-            </w:r>
-          </w:p>
-        </w:tc>
-        <w:tc>
-          <w:tcPr>
-            <w:tcW w:w="2880" w:type="dxa"/>
-          </w:tcPr>
-          <w:p>
-            <w:r>
-              <w:t>mm</w:t>
+          </w:p>
+        </w:tc>
+        <w:tc>
+          <w:tcPr>
+            <w:tcW w:w="2880" w:type="dxa"/>
+          </w:tcPr>
+          <w:p>
+            <w:r>
+              <w:t>Softpalate width</w:t>
+            </w:r>
+          </w:p>
+        </w:tc>
+        <w:tc>
+          <w:tcPr>
+            <w:tcW w:w="2880" w:type="dxa"/>
+          </w:tcPr>
+          <w:p>
+            <w:r>
+              <w:t>M</w:t>
+            </w:r>
+            <w:r>
+              <w:t>m</w:t>
             </w:r>
           </w:p>
         </w:tc>
@@ -5102,6 +5034,13 @@
           <w:sz w:val="32"/>
         </w:rPr>
         <w:t>Section 12. Treatment Variables</w:t>
+      </w:r>
+      <w:r>
+        <w:rPr>
+          <w:b/>
+          <w:sz w:val="32"/>
+        </w:rPr>
+        <w:t>: A/NA</w:t>
       </w:r>
     </w:p>
     <w:p>
@@ -5230,12 +5169,10 @@
             <w:tcW w:w="2880" w:type="dxa"/>
           </w:tcPr>
           <w:p>
-            <w:proofErr w:type="spellStart"/>
             <w:r>
               <w:lastRenderedPageBreak/>
               <w:t>Vertical_Setting</w:t>
             </w:r>
-            <w:proofErr w:type="spellEnd"/>
           </w:p>
         </w:tc>
         <w:tc>
@@ -5265,11 +5202,9 @@
             <w:tcW w:w="2880" w:type="dxa"/>
           </w:tcPr>
           <w:p>
-            <w:proofErr w:type="spellStart"/>
             <w:r>
               <w:t>CPAP_Used</w:t>
             </w:r>
-            <w:proofErr w:type="spellEnd"/>
           </w:p>
         </w:tc>
         <w:tc>
@@ -5299,11 +5234,9 @@
             <w:tcW w:w="2880" w:type="dxa"/>
           </w:tcPr>
           <w:p>
-            <w:proofErr w:type="spellStart"/>
             <w:r>
               <w:t>Positional_Device</w:t>
             </w:r>
-            <w:proofErr w:type="spellEnd"/>
           </w:p>
         </w:tc>
         <w:tc>
@@ -5333,11 +5266,9 @@
             <w:tcW w:w="2880" w:type="dxa"/>
           </w:tcPr>
           <w:p>
-            <w:proofErr w:type="spellStart"/>
             <w:r>
               <w:t>Weight_Treatment</w:t>
             </w:r>
-            <w:proofErr w:type="spellEnd"/>
           </w:p>
         </w:tc>
         <w:tc>
@@ -5367,11 +5298,9 @@
             <w:tcW w:w="2880" w:type="dxa"/>
           </w:tcPr>
           <w:p>
-            <w:proofErr w:type="spellStart"/>
             <w:r>
               <w:t>Lifestyle_modification</w:t>
             </w:r>
-            <w:proofErr w:type="spellEnd"/>
           </w:p>
         </w:tc>
         <w:tc>
@@ -5470,17 +5399,8 @@
           <w:lang w:val="es-ES"/>
         </w:rPr>
         <w:tab/>
-        <w:t xml:space="preserve">EVO </w:t>
+        <w:t>EVO ProSomnus</w:t>
       </w:r>
-      <w:proofErr w:type="spellStart"/>
-      <w:r>
-        <w:rPr>
-          <w:sz w:val="24"/>
-          <w:lang w:val="es-ES"/>
-        </w:rPr>
-        <w:t>ProSomnus</w:t>
-      </w:r>
-      <w:proofErr w:type="spellEnd"/>
     </w:p>
     <w:p>
       <w:pPr>
@@ -5500,33 +5420,8 @@
           <w:sz w:val="24"/>
           <w:lang w:val="es-ES"/>
         </w:rPr>
-        <w:t xml:space="preserve">EVO </w:t>
+        <w:t>EVO Select ProSomnus</w:t>
       </w:r>
-      <w:proofErr w:type="spellStart"/>
-      <w:r>
-        <w:rPr>
-          <w:sz w:val="24"/>
-          <w:lang w:val="es-ES"/>
-        </w:rPr>
-        <w:t>Select</w:t>
-      </w:r>
-      <w:proofErr w:type="spellEnd"/>
-      <w:r>
-        <w:rPr>
-          <w:sz w:val="24"/>
-          <w:lang w:val="es-ES"/>
-        </w:rPr>
-        <w:t xml:space="preserve"> </w:t>
-      </w:r>
-      <w:proofErr w:type="spellStart"/>
-      <w:r>
-        <w:rPr>
-          <w:sz w:val="24"/>
-          <w:lang w:val="es-ES"/>
-        </w:rPr>
-        <w:t>ProSomnus</w:t>
-      </w:r>
-      <w:proofErr w:type="spellEnd"/>
     </w:p>
     <w:p>
       <w:pPr>
@@ -5567,17 +5462,8 @@
           <w:sz w:val="24"/>
           <w:lang w:val="es-ES"/>
         </w:rPr>
-        <w:t xml:space="preserve">Flex </w:t>
+        <w:t>Flex Somnodent</w:t>
       </w:r>
-      <w:proofErr w:type="spellStart"/>
-      <w:r>
-        <w:rPr>
-          <w:sz w:val="24"/>
-          <w:lang w:val="es-ES"/>
-        </w:rPr>
-        <w:t>Somnodent</w:t>
-      </w:r>
-      <w:proofErr w:type="spellEnd"/>
     </w:p>
     <w:p>
       <w:pPr>
@@ -5591,19 +5477,11 @@
           <w:sz w:val="24"/>
         </w:rPr>
       </w:pPr>
-      <w:proofErr w:type="spellStart"/>
       <w:r>
         <w:rPr>
           <w:sz w:val="24"/>
         </w:rPr>
-        <w:t>Orthoapnea</w:t>
-      </w:r>
-      <w:proofErr w:type="spellEnd"/>
-      <w:r>
-        <w:rPr>
-          <w:sz w:val="24"/>
-        </w:rPr>
-        <w:t xml:space="preserve"> NOA </w:t>
+        <w:t xml:space="preserve">Orthoapnea NOA </w:t>
       </w:r>
     </w:p>
     <w:p>
@@ -5633,31 +5511,13 @@
           <w:lang w:val="es-ES"/>
         </w:rPr>
       </w:pPr>
-      <w:proofErr w:type="spellStart"/>
       <w:r>
         <w:rPr>
           <w:sz w:val="24"/>
           <w:lang w:val="es-ES"/>
         </w:rPr>
-        <w:t>Positional</w:t>
+        <w:t>Positional Devices</w:t>
       </w:r>
-      <w:proofErr w:type="spellEnd"/>
-      <w:r>
-        <w:rPr>
-          <w:sz w:val="24"/>
-          <w:lang w:val="es-ES"/>
-        </w:rPr>
-        <w:t xml:space="preserve"> </w:t>
-      </w:r>
-      <w:proofErr w:type="spellStart"/>
-      <w:r>
-        <w:rPr>
-          <w:sz w:val="24"/>
-          <w:lang w:val="es-ES"/>
-        </w:rPr>
-        <w:t>Devices</w:t>
-      </w:r>
-      <w:proofErr w:type="spellEnd"/>
     </w:p>
     <w:p>
       <w:pPr>
@@ -5702,19 +5562,11 @@
           <w:sz w:val="24"/>
         </w:rPr>
       </w:pPr>
-      <w:proofErr w:type="spellStart"/>
       <w:r>
         <w:rPr>
           <w:sz w:val="24"/>
         </w:rPr>
-        <w:t>Zzoma</w:t>
-      </w:r>
-      <w:proofErr w:type="spellEnd"/>
-      <w:r>
-        <w:rPr>
-          <w:sz w:val="24"/>
-        </w:rPr>
-        <w:t xml:space="preserve"> </w:t>
+        <w:t xml:space="preserve">Zzoma </w:t>
       </w:r>
     </w:p>
     <w:p>
@@ -5729,14 +5581,12 @@
           <w:sz w:val="24"/>
         </w:rPr>
       </w:pPr>
-      <w:proofErr w:type="spellStart"/>
       <w:r>
         <w:rPr>
           <w:sz w:val="24"/>
         </w:rPr>
         <w:t>SlumberBump</w:t>
       </w:r>
-      <w:proofErr w:type="spellEnd"/>
     </w:p>
     <w:p>
       <w:pPr>
@@ -5750,19 +5600,11 @@
           <w:sz w:val="24"/>
         </w:rPr>
       </w:pPr>
-      <w:proofErr w:type="spellStart"/>
       <w:r>
         <w:rPr>
           <w:sz w:val="24"/>
         </w:rPr>
-        <w:t>BluBuzz</w:t>
-      </w:r>
-      <w:proofErr w:type="spellEnd"/>
-      <w:r>
-        <w:rPr>
-          <w:sz w:val="24"/>
-        </w:rPr>
-        <w:t xml:space="preserve"> </w:t>
+        <w:t xml:space="preserve">BluBuzz </w:t>
       </w:r>
     </w:p>
     <w:p>
@@ -5778,19 +5620,11 @@
           <w:sz w:val="32"/>
         </w:rPr>
       </w:pPr>
-      <w:proofErr w:type="spellStart"/>
       <w:r>
         <w:rPr>
           <w:sz w:val="24"/>
         </w:rPr>
-        <w:t>Temu</w:t>
-      </w:r>
-      <w:proofErr w:type="spellEnd"/>
-      <w:r>
-        <w:rPr>
-          <w:sz w:val="24"/>
-        </w:rPr>
-        <w:t xml:space="preserve"> Collar</w:t>
+        <w:t>Temu Collar</w:t>
       </w:r>
     </w:p>
     <w:p>
@@ -5800,6 +5634,13 @@
           <w:sz w:val="32"/>
         </w:rPr>
         <w:t>Section 13. Follow-up and Outcome Variables</w:t>
+      </w:r>
+      <w:r>
+        <w:rPr>
+          <w:b/>
+          <w:sz w:val="32"/>
+        </w:rPr>
+        <w:t>: A/NA</w:t>
       </w:r>
     </w:p>
     <w:p>
@@ -5999,11 +5840,9 @@
             <w:tcW w:w="2880" w:type="dxa"/>
           </w:tcPr>
           <w:p>
-            <w:proofErr w:type="spellStart"/>
             <w:r>
               <w:t>Adverse_Effects</w:t>
             </w:r>
-            <w:proofErr w:type="spellEnd"/>
           </w:p>
         </w:tc>
         <w:tc>
@@ -6040,7 +5879,7 @@
 </file>
 
 <file path=word/numbering.xml><?xml version="1.0" encoding="utf-8"?>
-<w:numbering xmlns:wpc="http://schemas.microsoft.com/office/word/2010/wordprocessingCanvas" xmlns:cx="http://schemas.microsoft.com/office/drawing/2014/chartex" xmlns:cx1="http://schemas.microsoft.com/office/drawing/2015/9/8/chartex" xmlns:cx2="http://schemas.microsoft.com/office/drawing/2015/10/21/chartex" xmlns:cx3="http://schemas.microsoft.com/office/drawing/2016/5/9/chartex" xmlns:cx4="http://schemas.microsoft.com/office/drawing/2016/5/10/chartex" xmlns:cx5="http://schemas.microsoft.com/office/drawing/2016/5/11/chartex" xmlns:cx6="http://schemas.microsoft.com/office/drawing/2016/5/12/chartex" xmlns:cx7="http://schemas.microsoft.com/office/drawing/2016/5/13/chartex" xmlns:cx8="http://schemas.microsoft.com/office/drawing/2016/5/14/chartex" xmlns:mc="http://schemas.openxmlformats.org/markup-compatibility/2006" xmlns:aink="http://schemas.microsoft.com/office/drawing/2016/ink" xmlns:am3d="http://schemas.microsoft.com/office/drawing/2017/model3d" xmlns:o="urn:schemas-microsoft-com:office:office" xmlns:oel="http://schemas.microsoft.com/office/2019/extlst" xmlns:r="http://schemas.openxmlformats.org/officeDocument/2006/relationships" xmlns:m="http://schemas.openxmlformats.org/officeDocument/2006/math" xmlns:v="urn:schemas-microsoft-com:vml" xmlns:wp14="http://schemas.microsoft.com/office/word/2010/wordprocessingDrawing" xmlns:wp="http://schemas.openxmlformats.org/drawingml/2006/wordprocessingDrawing" xmlns:w10="urn:schemas-microsoft-com:office:word" xmlns:w="http://schemas.openxmlformats.org/wordprocessingml/2006/main" xmlns:w14="http://schemas.microsoft.com/office/word/2010/wordml" xmlns:w15="http://schemas.microsoft.com/office/word/2012/wordml" xmlns:w16cex="http://schemas.microsoft.com/office/word/2018/wordml/cex" xmlns:w16cid="http://schemas.microsoft.com/office/word/2016/wordml/cid" xmlns:w16="http://schemas.microsoft.com/office/word/2018/wordml" xmlns:w16du="http://schemas.microsoft.com/office/word/2023/wordml/word16du" xmlns:w16sdtdh="http://schemas.microsoft.com/office/word/2020/wordml/sdtdatahash" xmlns:w16sdtfl="http://schemas.microsoft.com/office/word/2024/wordml/sdtformatlock" xmlns:w16se="http://schemas.microsoft.com/office/word/2015/wordml/symex" xmlns:wpg="http://schemas.microsoft.com/office/word/2010/wordprocessingGroup" xmlns:wpi="http://schemas.microsoft.com/office/word/2010/wordprocessingInk" xmlns:wne="http://schemas.microsoft.com/office/word/2006/wordml" xmlns:wps="http://schemas.microsoft.com/office/word/2010/wordprocessingShape" mc:Ignorable="w14 w15 w16se w16cid w16 w16cex w16sdtdh w16sdtfl w16du wp14">
+<w:numbering xmlns:wpc="http://schemas.microsoft.com/office/word/2010/wordprocessingCanvas" xmlns:cx="http://schemas.microsoft.com/office/drawing/2014/chartex" xmlns:cx1="http://schemas.microsoft.com/office/drawing/2015/9/8/chartex" xmlns:cx2="http://schemas.microsoft.com/office/drawing/2015/10/21/chartex" xmlns:cx3="http://schemas.microsoft.com/office/drawing/2016/5/9/chartex" xmlns:cx4="http://schemas.microsoft.com/office/drawing/2016/5/10/chartex" xmlns:cx5="http://schemas.microsoft.com/office/drawing/2016/5/11/chartex" xmlns:cx6="http://schemas.microsoft.com/office/drawing/2016/5/12/chartex" xmlns:cx7="http://schemas.microsoft.com/office/drawing/2016/5/13/chartex" xmlns:cx8="http://schemas.microsoft.com/office/drawing/2016/5/14/chartex" xmlns:mc="http://schemas.openxmlformats.org/markup-compatibility/2006" xmlns:aink="http://schemas.microsoft.com/office/drawing/2016/ink" xmlns:am3d="http://schemas.microsoft.com/office/drawing/2017/model3d" xmlns:o="urn:schemas-microsoft-com:office:office" xmlns:r="http://schemas.openxmlformats.org/officeDocument/2006/relationships" xmlns:m="http://schemas.openxmlformats.org/officeDocument/2006/math" xmlns:v="urn:schemas-microsoft-com:vml" xmlns:wp14="http://schemas.microsoft.com/office/word/2010/wordprocessingDrawing" xmlns:wp="http://schemas.openxmlformats.org/drawingml/2006/wordprocessingDrawing" xmlns:w10="urn:schemas-microsoft-com:office:word" xmlns:w="http://schemas.openxmlformats.org/wordprocessingml/2006/main" xmlns:w14="http://schemas.microsoft.com/office/word/2010/wordml" xmlns:w15="http://schemas.microsoft.com/office/word/2012/wordml" xmlns:w16cex="http://schemas.microsoft.com/office/word/2018/wordml/cex" xmlns:w16cid="http://schemas.microsoft.com/office/word/2016/wordml/cid" xmlns:w16="http://schemas.microsoft.com/office/word/2018/wordml" xmlns:w16sdtdh="http://schemas.microsoft.com/office/word/2020/wordml/sdtdatahash" xmlns:w16se="http://schemas.microsoft.com/office/word/2015/wordml/symex" xmlns:wpg="http://schemas.microsoft.com/office/word/2010/wordprocessingGroup" xmlns:wpi="http://schemas.microsoft.com/office/word/2010/wordprocessingInk" xmlns:wne="http://schemas.microsoft.com/office/word/2006/wordml" xmlns:wps="http://schemas.microsoft.com/office/word/2010/wordprocessingShape" mc:Ignorable="w14 w15 w16se w16cid w16 w16cex w16sdtdh wp14">
   <w:abstractNum w:abstractNumId="0" w15:restartNumberingAfterBreak="0">
     <w:nsid w:val="FFFFFF7C"/>
     <w:multiLevelType w:val="singleLevel"/>
@@ -6674,50 +6513,50 @@
       </w:rPr>
     </w:lvl>
   </w:abstractNum>
-  <w:num w:numId="1" w16cid:durableId="1193762755">
+  <w:num w:numId="1">
     <w:abstractNumId w:val="8"/>
   </w:num>
-  <w:num w:numId="2" w16cid:durableId="1975215653">
+  <w:num w:numId="2">
     <w:abstractNumId w:val="6"/>
   </w:num>
-  <w:num w:numId="3" w16cid:durableId="1651516713">
+  <w:num w:numId="3">
     <w:abstractNumId w:val="5"/>
   </w:num>
-  <w:num w:numId="4" w16cid:durableId="1994791136">
+  <w:num w:numId="4">
     <w:abstractNumId w:val="4"/>
   </w:num>
-  <w:num w:numId="5" w16cid:durableId="1062748801">
+  <w:num w:numId="5">
     <w:abstractNumId w:val="7"/>
   </w:num>
-  <w:num w:numId="6" w16cid:durableId="789013057">
+  <w:num w:numId="6">
     <w:abstractNumId w:val="3"/>
   </w:num>
-  <w:num w:numId="7" w16cid:durableId="189955314">
+  <w:num w:numId="7">
     <w:abstractNumId w:val="2"/>
   </w:num>
-  <w:num w:numId="8" w16cid:durableId="204102117">
+  <w:num w:numId="8">
     <w:abstractNumId w:val="1"/>
   </w:num>
-  <w:num w:numId="9" w16cid:durableId="2064403770">
+  <w:num w:numId="9">
     <w:abstractNumId w:val="0"/>
   </w:num>
-  <w:num w:numId="10" w16cid:durableId="1836452497">
+  <w:num w:numId="10">
     <w:abstractNumId w:val="10"/>
   </w:num>
-  <w:num w:numId="11" w16cid:durableId="1963683555">
+  <w:num w:numId="11">
     <w:abstractNumId w:val="9"/>
   </w:num>
-  <w:num w:numId="12" w16cid:durableId="733356718">
+  <w:num w:numId="12">
     <w:abstractNumId w:val="12"/>
   </w:num>
-  <w:num w:numId="13" w16cid:durableId="592468583">
+  <w:num w:numId="13">
     <w:abstractNumId w:val="11"/>
   </w:num>
 </w:numbering>
 </file>
 
 <file path=word/styles.xml><?xml version="1.0" encoding="utf-8"?>
-<w:styles xmlns:mc="http://schemas.openxmlformats.org/markup-compatibility/2006" xmlns:r="http://schemas.openxmlformats.org/officeDocument/2006/relationships" xmlns:w="http://schemas.openxmlformats.org/wordprocessingml/2006/main" xmlns:w14="http://schemas.microsoft.com/office/word/2010/wordml" xmlns:w15="http://schemas.microsoft.com/office/word/2012/wordml" xmlns:w16cex="http://schemas.microsoft.com/office/word/2018/wordml/cex" xmlns:w16cid="http://schemas.microsoft.com/office/word/2016/wordml/cid" xmlns:w16="http://schemas.microsoft.com/office/word/2018/wordml" xmlns:w16du="http://schemas.microsoft.com/office/word/2023/wordml/word16du" xmlns:w16sdtdh="http://schemas.microsoft.com/office/word/2020/wordml/sdtdatahash" xmlns:w16sdtfl="http://schemas.microsoft.com/office/word/2024/wordml/sdtformatlock" xmlns:w16se="http://schemas.microsoft.com/office/word/2015/wordml/symex" mc:Ignorable="w14 w15 w16se w16cid w16 w16cex w16sdtdh w16sdtfl w16du">
+<w:styles xmlns:mc="http://schemas.openxmlformats.org/markup-compatibility/2006" xmlns:r="http://schemas.openxmlformats.org/officeDocument/2006/relationships" xmlns:w="http://schemas.openxmlformats.org/wordprocessingml/2006/main" xmlns:w14="http://schemas.microsoft.com/office/word/2010/wordml" xmlns:w15="http://schemas.microsoft.com/office/word/2012/wordml" xmlns:w16cex="http://schemas.microsoft.com/office/word/2018/wordml/cex" xmlns:w16cid="http://schemas.microsoft.com/office/word/2016/wordml/cid" xmlns:w16="http://schemas.microsoft.com/office/word/2018/wordml" xmlns:w16sdtdh="http://schemas.microsoft.com/office/word/2020/wordml/sdtdatahash" xmlns:w16se="http://schemas.microsoft.com/office/word/2015/wordml/symex" mc:Ignorable="w14 w15 w16se w16cid w16 w16cex w16sdtdh">
   <w:docDefaults>
     <w:rPrDefault>
       <w:rPr>

</xml_diff>